<commit_message>
Test plan document - updated
</commit_message>
<xml_diff>
--- a/Smart_Expense_Budget_Management_Test_Plan.docx
+++ b/Smart_Expense_Budget_Management_Test_Plan.docx
@@ -444,14 +444,6 @@
                 <w:rFonts w:ascii="Times New Roman" w:hAnsi="Times New Roman" w:cs="Times New Roman"/>
               </w:rPr>
             </w:pPr>
-            <w:r>
-              <w:rPr>
-                <w:rFonts w:ascii="Times New Roman" w:hAnsi="Times New Roman" w:cs="Times New Roman"/>
-                <w:sz w:val="18"/>
-                <w:szCs w:val="18"/>
-              </w:rPr>
-              <w:t xml:space="preserve">Bhu Vigna Reddy A T, </w:t>
-            </w:r>
             <w:proofErr w:type="spellStart"/>
             <w:r>
               <w:rPr>
@@ -459,6 +451,40 @@
                 <w:sz w:val="18"/>
                 <w:szCs w:val="18"/>
               </w:rPr>
+              <w:t>Bhu</w:t>
+            </w:r>
+            <w:r>
+              <w:rPr>
+                <w:rFonts w:ascii="Times New Roman" w:hAnsi="Times New Roman" w:cs="Times New Roman"/>
+                <w:sz w:val="18"/>
+                <w:szCs w:val="18"/>
+              </w:rPr>
+              <w:t>v</w:t>
+            </w:r>
+            <w:r>
+              <w:rPr>
+                <w:rFonts w:ascii="Times New Roman" w:hAnsi="Times New Roman" w:cs="Times New Roman"/>
+                <w:sz w:val="18"/>
+                <w:szCs w:val="18"/>
+              </w:rPr>
+              <w:t>igna</w:t>
+            </w:r>
+            <w:proofErr w:type="spellEnd"/>
+            <w:r>
+              <w:rPr>
+                <w:rFonts w:ascii="Times New Roman" w:hAnsi="Times New Roman" w:cs="Times New Roman"/>
+                <w:sz w:val="18"/>
+                <w:szCs w:val="18"/>
+              </w:rPr>
+              <w:t xml:space="preserve"> Reddy A T, </w:t>
+            </w:r>
+            <w:proofErr w:type="spellStart"/>
+            <w:r>
+              <w:rPr>
+                <w:rFonts w:ascii="Times New Roman" w:hAnsi="Times New Roman" w:cs="Times New Roman"/>
+                <w:sz w:val="18"/>
+                <w:szCs w:val="18"/>
+              </w:rPr>
               <w:t>Bijjala</w:t>
             </w:r>
             <w:proofErr w:type="spellEnd"/>
@@ -487,6 +513,59 @@
                 <w:szCs w:val="18"/>
               </w:rPr>
               <w:t xml:space="preserve"> Santosh Kumar</w:t>
+            </w:r>
+          </w:p>
+        </w:tc>
+      </w:tr>
+      <w:tr>
+        <w:trPr>
+          <w:jc w:val="center"/>
+        </w:trPr>
+        <w:tc>
+          <w:tcPr>
+            <w:tcW w:w="2200" w:type="dxa"/>
+          </w:tcPr>
+          <w:p>
+            <w:pPr>
+              <w:rPr>
+                <w:rFonts w:ascii="Times New Roman" w:hAnsi="Times New Roman" w:cs="Times New Roman"/>
+                <w:b/>
+                <w:bCs/>
+                <w:sz w:val="18"/>
+                <w:szCs w:val="18"/>
+              </w:rPr>
+            </w:pPr>
+            <w:r>
+              <w:rPr>
+                <w:rFonts w:ascii="Times New Roman" w:hAnsi="Times New Roman" w:cs="Times New Roman"/>
+                <w:b/>
+                <w:bCs/>
+                <w:sz w:val="18"/>
+                <w:szCs w:val="18"/>
+              </w:rPr>
+              <w:t>SRN</w:t>
+            </w:r>
+          </w:p>
+        </w:tc>
+        <w:tc>
+          <w:tcPr>
+            <w:tcW w:w="4800" w:type="dxa"/>
+          </w:tcPr>
+          <w:p>
+            <w:pPr>
+              <w:rPr>
+                <w:rFonts w:ascii="Times New Roman" w:hAnsi="Times New Roman" w:cs="Times New Roman"/>
+                <w:sz w:val="18"/>
+                <w:szCs w:val="18"/>
+              </w:rPr>
+            </w:pPr>
+            <w:r>
+              <w:rPr>
+                <w:rFonts w:ascii="Times New Roman" w:hAnsi="Times New Roman" w:cs="Times New Roman"/>
+                <w:sz w:val="18"/>
+                <w:szCs w:val="18"/>
+              </w:rPr>
+              <w:t xml:space="preserve">PES2UG24CS119, PES2UG24CS120, PES2UG24CS122, PES2UG24CS123 </w:t>
             </w:r>
           </w:p>
         </w:tc>
@@ -8815,6 +8894,7 @@
   <w:style w:type="character" w:default="1" w:styleId="DefaultParagraphFont">
     <w:name w:val="Default Paragraph Font"/>
     <w:uiPriority w:val="1"/>
+    <w:semiHidden/>
     <w:unhideWhenUsed/>
   </w:style>
   <w:style w:type="table" w:default="1" w:styleId="TableNormal">

</xml_diff>